<commit_message>
done all codes in this document.
</commit_message>
<xml_diff>
--- a/Lab/Sample If Else Programs.docx
+++ b/Lab/Sample If Else Programs.docx
@@ -24,7 +24,7 @@
         <w:rPr>
           <w:b/>
         </w:rPr>
-        <w:t xml:space="preserve">Program 1-To check Even and Odd Number in Java</w:t>
+        <w:t xml:space="preserve">Program 1-To check Even and Odd Number in Java - DONE</w:t>
       </w:r>
     </w:p>
     <w:p>
@@ -152,7 +152,7 @@
         <w:rPr>
           <w:b/>
         </w:rPr>
-        <w:t xml:space="preserve">Program 2-To Calculate Grade Calculator in Java</w:t>
+        <w:t xml:space="preserve">Program 2-To Calculate Grade Calculator in Java - DONE</w:t>
       </w:r>
     </w:p>
     <w:p>
@@ -279,6 +279,15 @@
       <w:r>
         <w:rPr/>
         <w:t xml:space="preserve">}</w:t>
+      </w:r>
+    </w:p>
+    <w:p>
+      <w:pPr>
+        <w:spacing w:lineRule="auto"/>
+      </w:pPr>
+      <w:r>
+        <w:rPr/>
+        <w:br w:type="textWrapping"/>
       </w:r>
     </w:p>
     <w:p>
@@ -289,7 +298,7 @@
         <w:rPr>
           <w:b/>
         </w:rPr>
-        <w:t xml:space="preserve">Write a program to check whether a number is divisible by 5 and 11 or not</w:t>
+        <w:t xml:space="preserve">Write a program to check whether a number is divisible by 5 and 11 or not - DONE</w:t>
       </w:r>
     </w:p>
     <w:p>
@@ -300,7 +309,7 @@
         <w:rPr>
           <w:b/>
         </w:rPr>
-        <w:t xml:space="preserve">Write a program to input month number and print month Name</w:t>
+        <w:t xml:space="preserve">Write a program to input month number and print month Name - DONE</w:t>
       </w:r>
     </w:p>
     <w:p>
@@ -311,7 +320,7 @@
         <w:rPr>
           <w:b/>
         </w:rPr>
-        <w:t xml:space="preserve">Write a program to calculate profit or loss</w:t>
+        <w:t xml:space="preserve">Write a program to calculate profit or loss - DONE</w:t>
       </w:r>
     </w:p>
   </w:body>

</xml_diff>